<commit_message>
Remove all em-dashes from resume prose
Seven substitutions: parentheses for the two paired cases, commas or
'as well as' elsewhere. En-dash date ranges kept. Re-restored the
generator-dropped blocks; tests pass.
</commit_message>
<xml_diff>
--- a/public/docs/reidcollins.docx
+++ b/public/docs/reidcollins.docx
@@ -162,7 +162,7 @@
           <w:rtl w:val="0"/>
           <w:lang w:val="en-US"/>
         </w:rPr>
-        <w:t>Senior Technical Program Manager / Software Developer building AI agents and workflow automation, on a hybrid background in software engineering, program leadership, and client-facing technical delivery. Track record spans large-scale platform migrations, ML/data platform delivery, and cross-functional initiatives on AWS — and production AI systems with the evaluation, observability, and cost controls to operate them.</w:t>
+        <w:t>Senior Technical Program Manager / Software Developer building AI agents and workflow automation, on a hybrid background in software engineering, program leadership, and client-facing technical delivery. Track record spans large-scale platform migrations, ML/data platform delivery, and cross-functional initiatives on AWS, as well as production AI systems with the evaluation, observability, and cost controls to operate them.</w:t>
       </w:r>
     </w:p>
     <w:p>
@@ -340,7 +340,7 @@
           <w:rtl w:val="0"/>
           <w:lang w:val="en-US"/>
         </w:rPr>
-        <w:t>Led program governance — roadmap execution, release planning, decision &amp; RAID logs, and dependency tracking — while building Jira/Notion/n8n automation that cut manual reporting ~2 hrs/week and stale tickets 20%</w:t>
+        <w:t>Led program governance (roadmap execution, release planning, decision &amp; RAID logs, and dependency tracking) while building Jira/Notion/n8n automation that cut manual reporting ~2 hrs/week and stale tickets 20%</w:t>
       </w:r>
     </w:p>
     <w:p>
@@ -375,7 +375,7 @@
           <w:rtl w:val="0"/>
           <w:lang w:val="en-US"/>
         </w:rPr>
-        <w:t>Led onboarding of 100+ clients to the ML platform over two quarters, translating client data requirements into ClickHouse-to-S3 + EventBridge ingestion for multi-terabyte datasets (10–50GB per client) and coordinating cross-account, multi-region (US/APAC/Japan) access — cutting average onboarding time by 30%</w:t>
+        <w:t>Led onboarding of 100+ clients to the ML platform over two quarters, translating client data requirements into ClickHouse-to-S3 + EventBridge ingestion for multi-terabyte datasets (10–50GB per client) and coordinating cross-account, multi-region (US/APAC/Japan) access, cutting average onboarding time by 30%</w:t>
       </w:r>
     </w:p>
     <w:p>
@@ -415,7 +415,7 @@
           <w:rtl w:val="0"/>
           <w:lang w:val="en-US"/>
         </w:rPr>
-        <w:t>Drove release delivery of three production ML models — Propensity-to-Purchase, Discount Optimization, and Send Time Optimization — on a serverless platform (Lambda, SQS, EventBridge, SageMaker), owning release planning, deployment readiness, and cross-functional dependencies through production launch</w:t>
+        <w:t>Drove release delivery of three production ML models (Propensity-to-Purchase, Discount Optimization, and Send Time Optimization) on a serverless platform (Lambda, SQS, EventBridge, SageMaker), owning release planning, deployment readiness, and cross-functional dependencies through production launch</w:t>
       </w:r>
     </w:p>
     <w:p>
@@ -490,7 +490,7 @@
           <w:rtl w:val="0"/>
           <w:lang w:val="en-US"/>
         </w:rPr>
-        <w:t>Developed a containerized API proxy and token management system on AWS ECS/Fargate, improving authentication reliability and horizontal scalability — sustaining a 400K messages/hour SLA (100K per container across 4 containers)</w:t>
+        <w:t>Developed a containerized API proxy and token management system on AWS ECS/Fargate, improving authentication reliability and horizontal scalability, sustaining a 400K messages/hour SLA (100K per container across 4 containers)</w:t>
       </w:r>
     </w:p>
     <w:p>
@@ -625,7 +625,7 @@
           <w:rtl w:val="0"/>
           <w:lang w:val="en-US"/>
         </w:rPr>
-        <w:t>Built AI-powered incident summarization system using AWS Lambda, SAM, DynamoDB, Claude, Slack, and Jira to ingest CloudWatch alarms and Bitbucket pipeline failures, consolidating repeat alerts from the same failing service into single incidents and generating operational summaries — cutting post-mortem turnaround from days to hours; later rebuilt and extended it as a live personal system with Datadog and GitHub Actions ingestion (incidents.hihelloreid.com)</w:t>
+        <w:t>Built AI-powered incident summarization system using AWS Lambda, SAM, DynamoDB, Claude, Slack, and Jira to ingest CloudWatch alarms and Bitbucket pipeline failures, consolidating repeat alerts from the same failing service into single incidents and generating operational summaries, cutting post-mortem turnaround from days to hours; later rebuilt and extended it as a live personal system with Datadog and GitHub Actions ingestion (incidents.hihelloreid.com)</w:t>
       </w:r>
     </w:p>
     <w:p>
@@ -1076,7 +1076,7 @@
           <w:rtl w:val="0"/>
           <w:lang w:val="en-US"/>
         </w:rPr>
-        <w:t xml:space="preserve">Bachelor of Arts, International Relations — </w:t>
+        <w:t xml:space="preserve">Bachelor of Arts, International Relations, </w:t>
       </w:r>
       <w:r>
         <w:rPr>

</xml_diff>

<commit_message>
Rebrand secondary title to Platform Engineer; center-safe og:image (RC1-514)
Change the current positioning and the Zeta/Marigold role from
"Senior Technical Program Manager / Software Developer" to
"... / Platform Engineer" across site branding, the on-screen resume,
the chatbot corpus, and the downloadable resume docs. Cheetah Digital
and CheetahMail historical titles are left as-is.

- index.html: meta description, og:image:alt, schema jobTitle
- src/data/resume.ts, src/data/resume-prompt.txt
- public/llms.txt, public/docs/reidcollins.txt
- public/docs/reidcollins.docx (surgical edit) + reidcollins.pdf
  regenerated via LibreOffice (text diff = the two role lines only)
- og:image: redesigned center-crop safe so LinkedIn's Featured tile
  renders cleanly; role line updated to Platform Engineer

reidcollins.pages (Pages master) can't be edited here and still says
"Software Developer" — needs a manual update to avoid reverting on a
future export.
</commit_message>
<xml_diff>
--- a/public/docs/reidcollins.docx
+++ b/public/docs/reidcollins.docx
@@ -162,7 +162,7 @@
           <w:rtl w:val="0"/>
           <w:lang w:val="en-US"/>
         </w:rPr>
-        <w:t>Senior Technical Program Manager / Software Developer building AI agents and workflow automation, on a hybrid background in software engineering, program leadership, and client-facing technical delivery. Track record spans large-scale platform migrations, ML/data platform delivery, and cross-functional initiatives on AWS, as well as production AI systems with the evaluation, observability, and cost controls to operate them.</w:t>
+        <w:t>Senior Technical Program Manager / Platform Engineer building AI agents and workflow automation, on a hybrid background in software engineering, program leadership, and client-facing technical delivery. Track record spans large-scale platform migrations, ML/data platform delivery, and cross-functional initiatives on AWS, as well as production AI systems with the evaluation, observability, and cost controls to operate them.</w:t>
       </w:r>
     </w:p>
     <w:p>
@@ -245,7 +245,7 @@
           <w:rtl w:val="0"/>
           <w:lang w:val="en-US"/>
         </w:rPr>
-        <w:t>Senior Technical Program Manager / Software Developer</w:t>
+        <w:t>Senior Technical Program Manager / Platform Engineer</w:t>
       </w:r>
     </w:p>
     <w:p>

</xml_diff>